<commit_message>
S2: referenciar antes que reproducir la evidencia de la compañía (D146)
21 §4.3 con requisitos de la evidencia referenciada y tabla de equivalencias;
EV.10 y LV-EV la admiten; T01 registra el origen de cada evidencia
(esquema 0.8, campos opcionales) con tres ejemplos en la demostración.
Las referencias a las siete condiciones de 01 §14 pasan al núcleo en 38, 90,
91, 11, 37, 96, P32, P33, P70, glosario, M09 y T15. Sección 38 de la
verificación.

Co-Authored-By: Claude Opus 5.5 <noreply@anthropic.com>
Claude-Session: https://claude.ai/code/session_014iYio6LvvzJ7Wvzr7BZcsM
</commit_message>
<xml_diff>
--- a/SEVEN-G/docx/en/plantillas/P32_SEVEN-G_Mandato_de_implantacion.docx
+++ b/SEVEN-G/docx/en/plantillas/P32_SEVEN-G_Mandato_de_implantacion.docx
@@ -1830,7 +1830,7 @@
         <w:t xml:space="preserve">modularly</w:t>
       </w:r>
       <w:r>
-        <w:t xml:space="preserve"> by components (01 §1.2). Modular adoption is valid, but the company may only declare that it applies SEVEN-G once it meets the seven conditions in 01 §14.</w:t>
+        <w:t xml:space="preserve"> by components (01 §1.2). Modular adoption is valid, but the company may only declare that it applies SEVEN-G once it meets the fourteen core rules (01 §14.1).</w:t>
       </w:r>
     </w:p>
     <w:tbl>
@@ -5514,7 +5514,7 @@
               <w:pStyle w:val="Celda"/>
             </w:pPr>
             <w:r>
-              <w:t xml:space="preserve">Conditions in 01 §14 substantiated (out of 7)</w:t>
+              <w:t xml:space="preserve">Core rules (01 §14.1) substantiated (out of 14)</w:t>
             </w:r>
           </w:p>
         </w:tc>

</xml_diff>